<commit_message>
Trekkeplan klasse-starttider ombygges også ved åpning av løp.
</commit_message>
<xml_diff>
--- a/docs/README.docx
+++ b/docs/README.docx
@@ -127,7 +127,6 @@
         </w:r>
       </w:hyperlink>
     </w:p>
-    <w:p/>
     <w:p>
       <w:pPr>
         <w:pStyle w:val="Title"/>
@@ -159,7 +158,6 @@
         </w:r>
       </w:hyperlink>
     </w:p>
-    <w:p/>
     <w:p>
       <w:pPr>
         <w:pStyle w:val="Title"/>
@@ -493,18 +491,90 @@
         <w:t>.</w:t>
       </w:r>
     </w:p>
+    <w:p>
+      <w:r>
+        <w:t xml:space="preserve">Oppgraderinger til nye </w:t>
+      </w:r>
+      <w:r>
+        <w:t>versjoner vil skje automatisk.</w:t>
+      </w:r>
+      <w:r>
+        <w:t xml:space="preserve"> </w:t>
+      </w:r>
+    </w:p>
+    <w:p>
+      <w:r>
+        <w:t>NB: Ved første gangs oppstart kan du få (med visse antivirus programmer)</w:t>
+      </w:r>
+      <w:r>
+        <w:br/>
+      </w:r>
+      <w:proofErr w:type="spellStart"/>
+      <w:r>
+        <w:rPr>
+          <w:i/>
+          <w:iCs/>
+        </w:rPr>
+        <w:t>Error</w:t>
+      </w:r>
+      <w:proofErr w:type="spellEnd"/>
+      <w:r>
+        <w:rPr>
+          <w:i/>
+          <w:iCs/>
+        </w:rPr>
+        <w:t xml:space="preserve">: </w:t>
+      </w:r>
+      <w:proofErr w:type="spellStart"/>
+      <w:r>
+        <w:rPr>
+          <w:i/>
+          <w:iCs/>
+        </w:rPr>
+        <w:t>Failed</w:t>
+      </w:r>
+      <w:proofErr w:type="spellEnd"/>
+      <w:r>
+        <w:rPr>
+          <w:i/>
+          <w:iCs/>
+        </w:rPr>
+        <w:t xml:space="preserve"> to </w:t>
+      </w:r>
+      <w:proofErr w:type="spellStart"/>
+      <w:r>
+        <w:rPr>
+          <w:i/>
+          <w:iCs/>
+        </w:rPr>
+        <w:t>embedded</w:t>
+      </w:r>
+      <w:proofErr w:type="spellEnd"/>
+      <w:r>
+        <w:rPr>
+          <w:i/>
+          <w:iCs/>
+        </w:rPr>
+        <w:t xml:space="preserve"> </w:t>
+      </w:r>
+      <w:proofErr w:type="spellStart"/>
+      <w:r>
+        <w:rPr>
+          <w:i/>
+          <w:iCs/>
+        </w:rPr>
+        <w:t>python</w:t>
+      </w:r>
+      <w:proofErr w:type="spellEnd"/>
+      <w:r>
+        <w:rPr>
+          <w:i/>
+          <w:iCs/>
+        </w:rPr>
+        <w:t xml:space="preserve"> interpreter!</w:t>
+      </w:r>
+    </w:p>
     <w:p/>
-    <w:p>
-      <w:r>
-        <w:t xml:space="preserve">Oppgraderinger til nye </w:t>
-      </w:r>
-      <w:r>
-        <w:t>versjoner vil skje automatisk.</w:t>
-      </w:r>
-      <w:r>
-        <w:t xml:space="preserve"> </w:t>
-      </w:r>
-    </w:p>
     <w:sectPr>
       <w:pgSz w:w="11906" w:h="16838"/>
       <w:pgMar w:top="1417" w:right="1417" w:bottom="1417" w:left="1417" w:header="708" w:footer="708" w:gutter="0"/>
@@ -1774,7 +1844,6 @@
   <w:style w:type="character" w:default="1" w:styleId="DefaultParagraphFont">
     <w:name w:val="Default Paragraph Font"/>
     <w:uiPriority w:val="1"/>
-    <w:semiHidden/>
     <w:unhideWhenUsed/>
   </w:style>
   <w:style w:type="table" w:default="1" w:styleId="TableNormal">
@@ -2121,6 +2190,36 @@
     <w:rPr>
       <w:color w:val="96607D" w:themeColor="followedHyperlink"/>
       <w:u w:val="single"/>
+    </w:rPr>
+  </w:style>
+  <w:style w:type="paragraph" w:styleId="HTMLPreformatted">
+    <w:name w:val="HTML Preformatted"/>
+    <w:basedOn w:val="Normal"/>
+    <w:link w:val="HTMLPreformattedChar"/>
+    <w:uiPriority w:val="99"/>
+    <w:semiHidden/>
+    <w:unhideWhenUsed/>
+    <w:rsid w:val="00195F6A"/>
+    <w:pPr>
+      <w:spacing w:after="0" w:line="240" w:lineRule="auto"/>
+    </w:pPr>
+    <w:rPr>
+      <w:rFonts w:ascii="Consolas" w:hAnsi="Consolas"/>
+      <w:sz w:val="20"/>
+      <w:szCs w:val="20"/>
+    </w:rPr>
+  </w:style>
+  <w:style w:type="character" w:customStyle="1" w:styleId="HTMLPreformattedChar">
+    <w:name w:val="HTML Preformatted Char"/>
+    <w:basedOn w:val="DefaultParagraphFont"/>
+    <w:link w:val="HTMLPreformatted"/>
+    <w:uiPriority w:val="99"/>
+    <w:semiHidden/>
+    <w:rsid w:val="00195F6A"/>
+    <w:rPr>
+      <w:rFonts w:ascii="Consolas" w:hAnsi="Consolas"/>
+      <w:sz w:val="20"/>
+      <w:szCs w:val="20"/>
     </w:rPr>
   </w:style>
 </w:styles>

</xml_diff>